<commit_message>
added some notes for reference
</commit_message>
<xml_diff>
--- a/week8_GIT/2. implementing .gitignore.docx
+++ b/week8_GIT/2. implementing .gitignore.docx
@@ -22,17 +22,7 @@
           <w:u w:val="single"/>
           <w:lang w:val="en-US"/>
         </w:rPr>
-        <w:t>Implementing .</w:t>
-      </w:r>
-      <w:proofErr w:type="spellStart"/>
-      <w:r>
-        <w:rPr>
-          <w:b/>
-          <w:bCs/>
-          <w:u w:val="single"/>
-          <w:lang w:val="en-US"/>
-        </w:rPr>
-        <w:t>gitignor</w:t>
+        <w:t>Implementing .gitignor</w:t>
       </w:r>
       <w:r>
         <w:rPr>
@@ -43,7 +33,6 @@
         </w:rPr>
         <w:t>e</w:t>
       </w:r>
-      <w:proofErr w:type="spellEnd"/>
     </w:p>
     <w:p>
       <w:pPr>
@@ -105,21 +94,7 @@
         <w:rPr>
           <w:lang w:val="en-US"/>
         </w:rPr>
-        <w:t xml:space="preserve">log folder using touch and </w:t>
-      </w:r>
-      <w:proofErr w:type="spellStart"/>
-      <w:r>
-        <w:rPr>
-          <w:lang w:val="en-US"/>
-        </w:rPr>
-        <w:t>mkdir</w:t>
-      </w:r>
-      <w:proofErr w:type="spellEnd"/>
-      <w:r>
-        <w:rPr>
-          <w:lang w:val="en-US"/>
-        </w:rPr>
-        <w:t xml:space="preserve"> commands</w:t>
+        <w:t>log folder using touch and mkdir commands</w:t>
       </w:r>
     </w:p>
     <w:p>
@@ -140,21 +115,7 @@
         <w:rPr>
           <w:lang w:val="en-US"/>
         </w:rPr>
-        <w:t xml:space="preserve">Verified whether the files and folder </w:t>
-      </w:r>
-      <w:proofErr w:type="gramStart"/>
-      <w:r>
-        <w:rPr>
-          <w:lang w:val="en-US"/>
-        </w:rPr>
-        <w:t>is</w:t>
-      </w:r>
-      <w:proofErr w:type="gramEnd"/>
-      <w:r>
-        <w:rPr>
-          <w:lang w:val="en-US"/>
-        </w:rPr>
-        <w:t xml:space="preserve"> created or not, using, ls -l</w:t>
+        <w:t>Verified whether the files and folder is created or not, using, ls -l</w:t>
       </w:r>
     </w:p>
     <w:p>
@@ -171,27 +132,11 @@
           <w:lang w:val="en-US"/>
         </w:rPr>
       </w:pPr>
-      <w:proofErr w:type="gramStart"/>
-      <w:r>
-        <w:rPr>
-          <w:lang w:val="en-US"/>
-        </w:rPr>
-        <w:t>Created .</w:t>
-      </w:r>
-      <w:proofErr w:type="spellStart"/>
-      <w:r>
-        <w:rPr>
-          <w:lang w:val="en-US"/>
-        </w:rPr>
-        <w:t>gitignore</w:t>
-      </w:r>
-      <w:proofErr w:type="spellEnd"/>
-      <w:proofErr w:type="gramEnd"/>
-      <w:r>
-        <w:rPr>
-          <w:lang w:val="en-US"/>
-        </w:rPr>
-        <w:t xml:space="preserve"> file</w:t>
+      <w:r>
+        <w:rPr>
+          <w:lang w:val="en-US"/>
+        </w:rPr>
+        <w:t>Created .gitignore file</w:t>
       </w:r>
       <w:r>
         <w:rPr>
@@ -287,29 +232,7 @@
         <w:rPr>
           <w:lang w:val="en-US"/>
         </w:rPr>
-        <w:t xml:space="preserve">Log/ are not shown in untracked files, as they match the rules </w:t>
-      </w:r>
-      <w:proofErr w:type="gramStart"/>
-      <w:r>
-        <w:rPr>
-          <w:lang w:val="en-US"/>
-        </w:rPr>
-        <w:t>in .</w:t>
-      </w:r>
-      <w:proofErr w:type="spellStart"/>
-      <w:r>
-        <w:rPr>
-          <w:lang w:val="en-US"/>
-        </w:rPr>
-        <w:t>gitignore</w:t>
-      </w:r>
-      <w:proofErr w:type="spellEnd"/>
-      <w:proofErr w:type="gramEnd"/>
-      <w:r>
-        <w:rPr>
-          <w:lang w:val="en-US"/>
-        </w:rPr>
-        <w:t xml:space="preserve"> and hence, they are ignored by git</w:t>
+        <w:t>Log/ are not shown in untracked files, as they match the rules in .gitignore and hence, they are ignored by git</w:t>
       </w:r>
       <w:r>
         <w:rPr>
@@ -1047,6 +970,256 @@
         </w:drawing>
       </w:r>
     </w:p>
+    <w:p>
+      <w:pPr>
+        <w:tabs>
+          <w:tab w:val="left" w:pos="5103"/>
+        </w:tabs>
+        <w:rPr>
+          <w:b/>
+          <w:bCs/>
+          <w:u w:val="single"/>
+          <w:lang w:val="en-US"/>
+        </w:rPr>
+      </w:pPr>
+      <w:r>
+        <w:rPr>
+          <w:b/>
+          <w:bCs/>
+          <w:u w:val="single"/>
+          <w:lang w:val="en-US"/>
+        </w:rPr>
+        <w:t>Summary of git commands:</w:t>
+      </w:r>
+    </w:p>
+    <w:p>
+      <w:pPr>
+        <w:pStyle w:val="ListParagraph"/>
+        <w:numPr>
+          <w:ilvl w:val="0"/>
+          <w:numId w:val="3"/>
+        </w:numPr>
+        <w:tabs>
+          <w:tab w:val="left" w:pos="5103"/>
+        </w:tabs>
+        <w:rPr>
+          <w:b/>
+          <w:bCs/>
+          <w:u w:val="single"/>
+          <w:lang w:val="en-US"/>
+        </w:rPr>
+      </w:pPr>
+      <w:r>
+        <w:rPr>
+          <w:lang w:val="en-US"/>
+        </w:rPr>
+        <w:t>touch: creates a new empty file, if already exists</w:t>
+      </w:r>
+      <w:r>
+        <w:rPr>
+          <w:lang w:val="en-US"/>
+        </w:rPr>
+        <w:t>, it updates the timestamp (modification time) but doesn’t open it.</w:t>
+      </w:r>
+    </w:p>
+    <w:p>
+      <w:pPr>
+        <w:pStyle w:val="ListParagraph"/>
+        <w:numPr>
+          <w:ilvl w:val="0"/>
+          <w:numId w:val="3"/>
+        </w:numPr>
+        <w:tabs>
+          <w:tab w:val="left" w:pos="5103"/>
+        </w:tabs>
+        <w:rPr>
+          <w:b/>
+          <w:bCs/>
+          <w:u w:val="single"/>
+          <w:lang w:val="en-US"/>
+        </w:rPr>
+      </w:pPr>
+      <w:r>
+        <w:rPr>
+          <w:lang w:val="en-US"/>
+        </w:rPr>
+        <w:t>mkdir: creates a new folder.</w:t>
+      </w:r>
+    </w:p>
+    <w:p>
+      <w:pPr>
+        <w:pStyle w:val="ListParagraph"/>
+        <w:numPr>
+          <w:ilvl w:val="0"/>
+          <w:numId w:val="3"/>
+        </w:numPr>
+        <w:tabs>
+          <w:tab w:val="left" w:pos="5103"/>
+        </w:tabs>
+        <w:rPr>
+          <w:b/>
+          <w:bCs/>
+          <w:u w:val="single"/>
+          <w:lang w:val="en-US"/>
+        </w:rPr>
+      </w:pPr>
+      <w:r>
+        <w:rPr>
+          <w:lang w:val="en-US"/>
+        </w:rPr>
+        <w:t>ls: lists files and directories</w:t>
+      </w:r>
+    </w:p>
+    <w:p>
+      <w:pPr>
+        <w:pStyle w:val="ListParagraph"/>
+        <w:numPr>
+          <w:ilvl w:val="1"/>
+          <w:numId w:val="3"/>
+        </w:numPr>
+        <w:tabs>
+          <w:tab w:val="left" w:pos="5103"/>
+        </w:tabs>
+        <w:rPr>
+          <w:b/>
+          <w:bCs/>
+          <w:u w:val="single"/>
+          <w:lang w:val="en-US"/>
+        </w:rPr>
+      </w:pPr>
+      <w:r>
+        <w:rPr>
+          <w:lang w:val="en-US"/>
+        </w:rPr>
+        <w:t>ls -l: long list with size, date</w:t>
+      </w:r>
+      <w:r>
+        <w:rPr>
+          <w:lang w:val="en-US"/>
+        </w:rPr>
+        <w:t xml:space="preserve"> (all non</w:t>
+      </w:r>
+      <w:r>
+        <w:rPr>
+          <w:lang w:val="en-US"/>
+        </w:rPr>
+        <w:t>-</w:t>
+      </w:r>
+      <w:r>
+        <w:rPr>
+          <w:lang w:val="en-US"/>
+        </w:rPr>
+        <w:t>hidden files and folders)</w:t>
+      </w:r>
+    </w:p>
+    <w:p>
+      <w:pPr>
+        <w:pStyle w:val="ListParagraph"/>
+        <w:numPr>
+          <w:ilvl w:val="1"/>
+          <w:numId w:val="3"/>
+        </w:numPr>
+        <w:tabs>
+          <w:tab w:val="left" w:pos="5103"/>
+        </w:tabs>
+        <w:rPr>
+          <w:b/>
+          <w:bCs/>
+          <w:u w:val="single"/>
+          <w:lang w:val="en-US"/>
+        </w:rPr>
+      </w:pPr>
+      <w:r>
+        <w:rPr>
+          <w:lang w:val="en-US"/>
+        </w:rPr>
+        <w:t>ls -a: shows hidden files</w:t>
+      </w:r>
+      <w:r>
+        <w:rPr>
+          <w:lang w:val="en-US"/>
+        </w:rPr>
+        <w:t xml:space="preserve"> and folders</w:t>
+      </w:r>
+    </w:p>
+    <w:p>
+      <w:pPr>
+        <w:pStyle w:val="ListParagraph"/>
+        <w:numPr>
+          <w:ilvl w:val="1"/>
+          <w:numId w:val="3"/>
+        </w:numPr>
+        <w:tabs>
+          <w:tab w:val="left" w:pos="5103"/>
+        </w:tabs>
+        <w:rPr>
+          <w:b/>
+          <w:bCs/>
+          <w:u w:val="single"/>
+          <w:lang w:val="en-US"/>
+        </w:rPr>
+      </w:pPr>
+      <w:r>
+        <w:rPr>
+          <w:lang w:val="en-US"/>
+        </w:rPr>
+        <w:t>ls -la: combines both</w:t>
+      </w:r>
+    </w:p>
+    <w:p>
+      <w:pPr>
+        <w:pStyle w:val="ListParagraph"/>
+        <w:numPr>
+          <w:ilvl w:val="0"/>
+          <w:numId w:val="3"/>
+        </w:numPr>
+        <w:tabs>
+          <w:tab w:val="left" w:pos="5103"/>
+        </w:tabs>
+        <w:rPr>
+          <w:b/>
+          <w:bCs/>
+          <w:u w:val="single"/>
+          <w:lang w:val="en-US"/>
+        </w:rPr>
+      </w:pPr>
+      <w:r>
+        <w:rPr>
+          <w:lang w:val="en-US"/>
+        </w:rPr>
+        <w:t>cat: used to show output of the file (what is inside it)</w:t>
+      </w:r>
+    </w:p>
+    <w:p>
+      <w:pPr>
+        <w:pStyle w:val="ListParagraph"/>
+        <w:numPr>
+          <w:ilvl w:val="0"/>
+          <w:numId w:val="3"/>
+        </w:numPr>
+        <w:tabs>
+          <w:tab w:val="left" w:pos="5103"/>
+        </w:tabs>
+        <w:rPr>
+          <w:b/>
+          <w:bCs/>
+          <w:u w:val="single"/>
+          <w:lang w:val="en-US"/>
+        </w:rPr>
+      </w:pPr>
+      <w:r>
+        <w:rPr>
+          <w:lang w:val="en-US"/>
+        </w:rPr>
+        <w:t xml:space="preserve">nano: </w:t>
+      </w:r>
+      <w:r>
+        <w:t>Opens the file in a terminal-based text editor called Nano</w:t>
+      </w:r>
+      <w:r>
+        <w:t>.</w:t>
+      </w:r>
+    </w:p>
     <w:sectPr>
       <w:pgSz w:w="11906" w:h="16838"/>
       <w:pgMar w:top="1440" w:right="1440" w:bottom="1440" w:left="1440" w:header="708" w:footer="708" w:gutter="0"/>
@@ -1311,11 +1484,103 @@
       </w:pPr>
     </w:lvl>
   </w:abstractNum>
+  <w:abstractNum w:abstractNumId="2" w15:restartNumberingAfterBreak="0">
+    <w:nsid w:val="48495F7A"/>
+    <w:multiLevelType w:val="hybridMultilevel"/>
+    <w:tmpl w:val="4A6C60D8"/>
+    <w:lvl w:ilvl="0" w:tplc="4009000F">
+      <w:start w:val="1"/>
+      <w:numFmt w:val="decimal"/>
+      <w:lvlText w:val="%1."/>
+      <w:lvlJc w:val="left"/>
+      <w:pPr>
+        <w:ind w:left="720" w:hanging="360"/>
+      </w:pPr>
+      <w:rPr>
+        <w:rFonts w:hint="default"/>
+      </w:rPr>
+    </w:lvl>
+    <w:lvl w:ilvl="1" w:tplc="40090019">
+      <w:start w:val="1"/>
+      <w:numFmt w:val="lowerLetter"/>
+      <w:lvlText w:val="%2."/>
+      <w:lvlJc w:val="left"/>
+      <w:pPr>
+        <w:ind w:left="1440" w:hanging="360"/>
+      </w:pPr>
+    </w:lvl>
+    <w:lvl w:ilvl="2" w:tplc="4009001B" w:tentative="1">
+      <w:start w:val="1"/>
+      <w:numFmt w:val="lowerRoman"/>
+      <w:lvlText w:val="%3."/>
+      <w:lvlJc w:val="right"/>
+      <w:pPr>
+        <w:ind w:left="2160" w:hanging="180"/>
+      </w:pPr>
+    </w:lvl>
+    <w:lvl w:ilvl="3" w:tplc="4009000F" w:tentative="1">
+      <w:start w:val="1"/>
+      <w:numFmt w:val="decimal"/>
+      <w:lvlText w:val="%4."/>
+      <w:lvlJc w:val="left"/>
+      <w:pPr>
+        <w:ind w:left="2880" w:hanging="360"/>
+      </w:pPr>
+    </w:lvl>
+    <w:lvl w:ilvl="4" w:tplc="40090019" w:tentative="1">
+      <w:start w:val="1"/>
+      <w:numFmt w:val="lowerLetter"/>
+      <w:lvlText w:val="%5."/>
+      <w:lvlJc w:val="left"/>
+      <w:pPr>
+        <w:ind w:left="3600" w:hanging="360"/>
+      </w:pPr>
+    </w:lvl>
+    <w:lvl w:ilvl="5" w:tplc="4009001B" w:tentative="1">
+      <w:start w:val="1"/>
+      <w:numFmt w:val="lowerRoman"/>
+      <w:lvlText w:val="%6."/>
+      <w:lvlJc w:val="right"/>
+      <w:pPr>
+        <w:ind w:left="4320" w:hanging="180"/>
+      </w:pPr>
+    </w:lvl>
+    <w:lvl w:ilvl="6" w:tplc="4009000F" w:tentative="1">
+      <w:start w:val="1"/>
+      <w:numFmt w:val="decimal"/>
+      <w:lvlText w:val="%7."/>
+      <w:lvlJc w:val="left"/>
+      <w:pPr>
+        <w:ind w:left="5040" w:hanging="360"/>
+      </w:pPr>
+    </w:lvl>
+    <w:lvl w:ilvl="7" w:tplc="40090019" w:tentative="1">
+      <w:start w:val="1"/>
+      <w:numFmt w:val="lowerLetter"/>
+      <w:lvlText w:val="%8."/>
+      <w:lvlJc w:val="left"/>
+      <w:pPr>
+        <w:ind w:left="5760" w:hanging="360"/>
+      </w:pPr>
+    </w:lvl>
+    <w:lvl w:ilvl="8" w:tplc="4009001B" w:tentative="1">
+      <w:start w:val="1"/>
+      <w:numFmt w:val="lowerRoman"/>
+      <w:lvlText w:val="%9."/>
+      <w:lvlJc w:val="right"/>
+      <w:pPr>
+        <w:ind w:left="6480" w:hanging="180"/>
+      </w:pPr>
+    </w:lvl>
+  </w:abstractNum>
   <w:num w:numId="1" w16cid:durableId="1494564037">
     <w:abstractNumId w:val="0"/>
   </w:num>
   <w:num w:numId="2" w16cid:durableId="1239098777">
     <w:abstractNumId w:val="1"/>
+  </w:num>
+  <w:num w:numId="3" w16cid:durableId="1602757881">
+    <w:abstractNumId w:val="2"/>
   </w:num>
 </w:numbering>
 </file>
@@ -1923,7 +2188,6 @@
   <w:style w:type="character" w:default="1" w:styleId="DefaultParagraphFont">
     <w:name w:val="Default Paragraph Font"/>
     <w:uiPriority w:val="1"/>
-    <w:semiHidden/>
     <w:unhideWhenUsed/>
   </w:style>
   <w:style w:type="table" w:default="1" w:styleId="TableNormal">

</xml_diff>